<commit_message>
Lafond Parte 4: revisão
Co-Authored-By: Claude Opus 5.5 <noreply@anthropic.com>
Claude-Session: https://claude.ai/code/session_01MJjUEEZrxQDEUifKK2vj9g
</commit_message>
<xml_diff>
--- a/roteiros/jorge-lafond/Lafond_Parte4.docx
+++ b/roteiros/jorge-lafond/Lafond_Parte4.docx
@@ -15,7 +15,7 @@
         <w:rPr>
           <w:color w:val="000000"/>
         </w:rPr>
-        <w:t>A denúncia de Padula se espalhou pelos sites de notícia.</w:t>
+        <w:t>A denúncia de Padula se espalhou pelos sites de notícia. E a resposta veio do próprio cemitério.</w:t>
       </w:r>
     </w:p>
     <w:p>
@@ -23,15 +23,7 @@
         <w:rPr>
           <w:color w:val="000000"/>
         </w:rPr>
-        <w:t>Logo depois, o cemitério se manifestou.</w:t>
-      </w:r>
-    </w:p>
-    <w:p>
-      <w:r>
-        <w:rPr>
-          <w:color w:val="000000"/>
-        </w:rPr>
-        <w:t>Desde agosto de dois mil e catorze, o Cemitério de Irajá deixou de ser administrado pela Santa Casa da Misericórdia. Quem assumiu foi uma concessionária privada chamada Rio Pax, que passou a cuidar de seis cemitérios públicos da cidade.</w:t>
+        <w:t>Em agosto de dois mil e catorze, o Cemitério de Irajá tinha deixado de ser administrado pela Santa Casa da Misericórdia. Quem assumiu foi uma concessionária privada chamada Rio Pax, que passou a cuidar de seis cemitérios públicos da cidade.</w:t>
       </w:r>
     </w:p>
     <w:p>
@@ -103,7 +95,7 @@
         <w:rPr>
           <w:color w:val="C00000"/>
         </w:rPr>
-        <w:t>Só que, para entender por que ninguém mais foi atrás desse corpo, você precisa conhecer a outra guerra que estava acontecendo ao mesmo tempo. Uma guerra que começou em volta da herança de Jorge e terminou com o homem que procurava por ele perdendo tudo.</w:t>
+        <w:t>Só que, para entender por que a busca por esse corpo parou, você precisa conhecer a outra guerra que estava acontecendo ao mesmo tempo. Uma guerra que começou em volta da herança de Jorge e terminou com o homem que procurava por ele perdendo tudo.</w:t>
       </w:r>
     </w:p>
     <w:p>

</xml_diff>